<commit_message>
Update algorithms and code files
</commit_message>
<xml_diff>
--- a/CTDLbasic/TRR/CKTRR/dijkstra_result.docx
+++ b/CTDLbasic/TRR/CKTRR/dijkstra_result.docx
@@ -595,7 +595,6 @@
         <w:tc>
           <w:tcPr>
             <w:tcW w:type="dxa" w:w="680"/>
-            <w:shd w:fill="FF0000"/>
             <w:tcBorders>
               <w:top w:val="single" w:sz="4" w:space="0" w:color="000000"/>
               <w:left w:val="single" w:sz="4" w:space="0" w:color="000000"/>
@@ -616,7 +615,7 @@
             <w:r>
               <w:rPr>
                 <w:b/>
-                <w:color w:val="FFFFFF"/>
+                <w:color w:val="FF0000"/>
               </w:rPr>
               <w:t>0.0</w:t>
             </w:r>
@@ -877,7 +876,6 @@
         <w:tc>
           <w:tcPr>
             <w:tcW w:type="dxa" w:w="680"/>
-            <w:shd w:fill="FF0000"/>
             <w:tcBorders>
               <w:top w:val="single" w:sz="4" w:space="0" w:color="000000"/>
               <w:left w:val="single" w:sz="4" w:space="0" w:color="000000"/>
@@ -898,7 +896,7 @@
             <w:r>
               <w:rPr>
                 <w:b/>
-                <w:color w:val="FFFFFF"/>
+                <w:color w:val="FF0000"/>
               </w:rPr>
               <w:t>5.0</w:t>
             </w:r>
@@ -1134,7 +1132,6 @@
         <w:tc>
           <w:tcPr>
             <w:tcW w:type="dxa" w:w="680"/>
-            <w:shd w:fill="FF0000"/>
             <w:tcBorders>
               <w:top w:val="single" w:sz="4" w:space="0" w:color="000000"/>
               <w:left w:val="single" w:sz="4" w:space="0" w:color="000000"/>
@@ -1155,7 +1152,7 @@
             <w:r>
               <w:rPr>
                 <w:b/>
-                <w:color w:val="FFFFFF"/>
+                <w:color w:val="FF0000"/>
               </w:rPr>
               <w:t>7.0</w:t>
             </w:r>
@@ -1316,7 +1313,6 @@
         <w:tc>
           <w:tcPr>
             <w:tcW w:type="dxa" w:w="680"/>
-            <w:shd w:fill="FF0000"/>
             <w:tcBorders>
               <w:top w:val="single" w:sz="4" w:space="0" w:color="000000"/>
               <w:left w:val="single" w:sz="4" w:space="0" w:color="000000"/>
@@ -1337,7 +1333,7 @@
             <w:r>
               <w:rPr>
                 <w:b/>
-                <w:color w:val="FFFFFF"/>
+                <w:color w:val="FF0000"/>
               </w:rPr>
               <w:t>8.0</w:t>
             </w:r>
@@ -1623,7 +1619,6 @@
         <w:tc>
           <w:tcPr>
             <w:tcW w:type="dxa" w:w="680"/>
-            <w:shd w:fill="FF0000"/>
             <w:tcBorders>
               <w:top w:val="single" w:sz="4" w:space="0" w:color="000000"/>
               <w:left w:val="single" w:sz="4" w:space="0" w:color="000000"/>
@@ -1644,7 +1639,7 @@
             <w:r>
               <w:rPr>
                 <w:b/>
-                <w:color w:val="FFFFFF"/>
+                <w:color w:val="FF0000"/>
               </w:rPr>
               <w:t>12.0</w:t>
             </w:r>
@@ -1905,7 +1900,6 @@
         <w:tc>
           <w:tcPr>
             <w:tcW w:type="dxa" w:w="680"/>
-            <w:shd w:fill="FF0000"/>
             <w:tcBorders>
               <w:top w:val="single" w:sz="4" w:space="0" w:color="000000"/>
               <w:left w:val="single" w:sz="4" w:space="0" w:color="000000"/>
@@ -1926,7 +1920,7 @@
             <w:r>
               <w:rPr>
                 <w:b/>
-                <w:color w:val="FFFFFF"/>
+                <w:color w:val="FF0000"/>
               </w:rPr>
               <w:t>19.0</w:t>
             </w:r>

</xml_diff>